<commit_message>
Ell: inserção da contribuição dos autores.
</commit_message>
<xml_diff>
--- a/docs/index.docx
+++ b/docs/index.docx
@@ -77,7 +77,7 @@
         <w:pStyle w:val="Data"/>
       </w:pPr>
       <w:r>
-        <w:t xml:space="preserve">2026-03-20</w:t>
+        <w:t xml:space="preserve">2026-03-21</w:t>
       </w:r>
     </w:p>
     <w:p>
@@ -438,7 +438,47 @@
         <w:pStyle w:val="Corpodetexto"/>
       </w:pPr>
       <w:r>
-        <w:t xml:space="preserve">Author1: Writing – review &amp; editing, Writing – original draft, Formal analysis, Data curation, Conceptualization. Author2: Writing – review &amp; editing, Data curation, Conceptualization. Author3: Writing – review &amp; editing, Formal analysis, Data curation, Conceptualization.</w:t>
+        <w:t xml:space="preserve">Ellen Gomes da Silva: Data curation, Formal analysis, Investigation, Software, Visualization, Writing – original draft, Writing – review &amp; editing.</w:t>
+      </w:r>
+    </w:p>
+    <w:p>
+      <w:pPr>
+        <w:pStyle w:val="Corpodetexto"/>
+      </w:pPr>
+      <w:r>
+        <w:t xml:space="preserve">Mayara Mirelly da Silva Monteiro: Data curation, Formal analysis, Software.</w:t>
+      </w:r>
+    </w:p>
+    <w:p>
+      <w:pPr>
+        <w:pStyle w:val="Corpodetexto"/>
+      </w:pPr>
+      <w:r>
+        <w:t xml:space="preserve">Marcela Vitória Bernardo da Silva: Writing – original draft, Writing – review &amp; editing..</w:t>
+      </w:r>
+    </w:p>
+    <w:p>
+      <w:pPr>
+        <w:pStyle w:val="Corpodetexto"/>
+      </w:pPr>
+      <w:r>
+        <w:t xml:space="preserve">Ludmilla Cavalcanti Antunes Lucena: Writing – review &amp; editing.</w:t>
+      </w:r>
+    </w:p>
+    <w:p>
+      <w:pPr>
+        <w:pStyle w:val="Corpodetexto"/>
+      </w:pPr>
+      <w:r>
+        <w:t xml:space="preserve">Thais Xavier de Melo: Supervision.</w:t>
+      </w:r>
+    </w:p>
+    <w:p>
+      <w:pPr>
+        <w:pStyle w:val="Corpodetexto"/>
+      </w:pPr>
+      <w:r>
+        <w:t xml:space="preserve">Elvio Sergio Figueredo Medeiros: Conceptualization, Data curation, Formal analysis, Funding Acquisition, Methodology, Project Administration, Resources, Supervision, Validation.</w:t>
       </w:r>
     </w:p>
     <w:bookmarkEnd w:id="32"/>

</xml_diff>